<commit_message>
vu drafts for Feb: 8-14 hours fix
</commit_message>
<xml_diff>
--- a/flow/20230927_hours/Тропарі - Мінея/06-ЛЮТИЙ.docx
+++ b/flow/20230927_hours/Тропарі - Мінея/06-ЛЮТИЙ.docx
@@ -176,7 +176,103 @@
           <w:sz w:val="24"/>
           <w:szCs w:val="24"/>
         </w:rPr>
-        <w:t xml:space="preserve"> Небесний хор небесних ангелів, * приникши на землю, * бачить, як Мати, що не знала мужа, * вносить до храму Первородного всієї тварі, * що прийшов як немовля, * і тому з нами співає передпразденственну пісню, * радуючися.</w:t>
+        <w:t xml:space="preserve"> Небесний хор небесних ангелів,</w:t>
+      </w:r>
+      <w:r>
+        <w:rPr>
+          <w:rFonts w:ascii="Times New Roman" w:eastAsia="Times New Roman" w:hAnsi="Times New Roman" w:cs="Times New Roman"/>
+          <w:sz w:val="24"/>
+          <w:szCs w:val="24"/>
+        </w:rPr>
+        <w:t>*</w:t>
+      </w:r>
+      <w:r>
+        <w:rPr>
+          <w:rFonts w:ascii="Times New Roman" w:eastAsia="Times New Roman" w:hAnsi="Times New Roman" w:cs="Times New Roman"/>
+          <w:sz w:val="24"/>
+          <w:szCs w:val="24"/>
+        </w:rPr>
+        <w:t xml:space="preserve"> приникши на землю,</w:t>
+      </w:r>
+      <w:r>
+        <w:rPr>
+          <w:rFonts w:ascii="Times New Roman" w:eastAsia="Times New Roman" w:hAnsi="Times New Roman" w:cs="Times New Roman"/>
+          <w:sz w:val="24"/>
+          <w:szCs w:val="24"/>
+        </w:rPr>
+        <w:t>*</w:t>
+      </w:r>
+      <w:r>
+        <w:rPr>
+          <w:rFonts w:ascii="Times New Roman" w:eastAsia="Times New Roman" w:hAnsi="Times New Roman" w:cs="Times New Roman"/>
+          <w:sz w:val="24"/>
+          <w:szCs w:val="24"/>
+        </w:rPr>
+        <w:t xml:space="preserve"> бачить, як Мати, що не знала мужа,</w:t>
+      </w:r>
+      <w:r>
+        <w:rPr>
+          <w:rFonts w:ascii="Times New Roman" w:eastAsia="Times New Roman" w:hAnsi="Times New Roman" w:cs="Times New Roman"/>
+          <w:sz w:val="24"/>
+          <w:szCs w:val="24"/>
+        </w:rPr>
+        <w:t>*</w:t>
+      </w:r>
+      <w:r>
+        <w:rPr>
+          <w:rFonts w:ascii="Times New Roman" w:eastAsia="Times New Roman" w:hAnsi="Times New Roman" w:cs="Times New Roman"/>
+          <w:sz w:val="24"/>
+          <w:szCs w:val="24"/>
+        </w:rPr>
+        <w:t xml:space="preserve"> вносить до храму Первородного всієї тварі,</w:t>
+      </w:r>
+      <w:r>
+        <w:rPr>
+          <w:rFonts w:ascii="Times New Roman" w:eastAsia="Times New Roman" w:hAnsi="Times New Roman" w:cs="Times New Roman"/>
+          <w:sz w:val="24"/>
+          <w:szCs w:val="24"/>
+        </w:rPr>
+        <w:t>*</w:t>
+      </w:r>
+      <w:r>
+        <w:rPr>
+          <w:rFonts w:ascii="Times New Roman" w:eastAsia="Times New Roman" w:hAnsi="Times New Roman" w:cs="Times New Roman"/>
+          <w:sz w:val="24"/>
+          <w:szCs w:val="24"/>
+        </w:rPr>
+        <w:t xml:space="preserve"> що прийшов як немовля,</w:t>
+      </w:r>
+      <w:r>
+        <w:rPr>
+          <w:rFonts w:ascii="Times New Roman" w:eastAsia="Times New Roman" w:hAnsi="Times New Roman" w:cs="Times New Roman"/>
+          <w:sz w:val="24"/>
+          <w:szCs w:val="24"/>
+        </w:rPr>
+        <w:t>*</w:t>
+      </w:r>
+      <w:r>
+        <w:rPr>
+          <w:rFonts w:ascii="Times New Roman" w:eastAsia="Times New Roman" w:hAnsi="Times New Roman" w:cs="Times New Roman"/>
+          <w:sz w:val="24"/>
+          <w:szCs w:val="24"/>
+        </w:rPr>
+        <w:t xml:space="preserve"> і тому з нами співає передпразденственну пісню,</w:t>
+      </w:r>
+      <w:r>
+        <w:rPr>
+          <w:rFonts w:ascii="Times New Roman" w:eastAsia="Times New Roman" w:hAnsi="Times New Roman" w:cs="Times New Roman"/>
+          <w:sz w:val="24"/>
+          <w:szCs w:val="24"/>
+        </w:rPr>
+        <w:t>*</w:t>
+      </w:r>
+      <w:r>
+        <w:rPr>
+          <w:rFonts w:ascii="Times New Roman" w:eastAsia="Times New Roman" w:hAnsi="Times New Roman" w:cs="Times New Roman"/>
+          <w:sz w:val="24"/>
+          <w:szCs w:val="24"/>
+        </w:rPr>
+        <w:t xml:space="preserve"> радуючися.</w:t>
       </w:r>
     </w:p>
     <w:p>
@@ -206,7 +302,39 @@
           <w:sz w:val="24"/>
           <w:szCs w:val="24"/>
         </w:rPr>
-        <w:t xml:space="preserve"> З Отцем бувши, невидиме Слово нині ж видимим стало плоттю: * несказанно від Діви народилося і руками старечими дається святителеві. * Поклонімся Йому – істинному Богу нашому.</w:t>
+        <w:t xml:space="preserve"> З Отцем бувши, невидиме Слово нині ж видимим стало плоттю:</w:t>
+      </w:r>
+      <w:r>
+        <w:rPr>
+          <w:rFonts w:ascii="Times New Roman" w:eastAsia="Times New Roman" w:hAnsi="Times New Roman" w:cs="Times New Roman"/>
+          <w:sz w:val="24"/>
+          <w:szCs w:val="24"/>
+        </w:rPr>
+        <w:t>*</w:t>
+      </w:r>
+      <w:r>
+        <w:rPr>
+          <w:rFonts w:ascii="Times New Roman" w:eastAsia="Times New Roman" w:hAnsi="Times New Roman" w:cs="Times New Roman"/>
+          <w:sz w:val="24"/>
+          <w:szCs w:val="24"/>
+        </w:rPr>
+        <w:t xml:space="preserve"> несказанно від Діви народилося і руками старечими дається святителеві.</w:t>
+      </w:r>
+      <w:r>
+        <w:rPr>
+          <w:rFonts w:ascii="Times New Roman" w:eastAsia="Times New Roman" w:hAnsi="Times New Roman" w:cs="Times New Roman"/>
+          <w:sz w:val="24"/>
+          <w:szCs w:val="24"/>
+        </w:rPr>
+        <w:t>*</w:t>
+      </w:r>
+      <w:r>
+        <w:rPr>
+          <w:rFonts w:ascii="Times New Roman" w:eastAsia="Times New Roman" w:hAnsi="Times New Roman" w:cs="Times New Roman"/>
+          <w:sz w:val="24"/>
+          <w:szCs w:val="24"/>
+        </w:rPr>
+        <w:t xml:space="preserve"> Поклонімся Йому – істинному Богу нашому.</w:t>
       </w:r>
     </w:p>
     <w:p>
@@ -3992,7 +4120,71 @@
           <w:sz w:val="24"/>
           <w:szCs w:val="24"/>
         </w:rPr>
-        <w:t>Із землі засяяла Предтечі глава, * проміння випускає нетління, оздоровлення вірним; * з висот збирає множество ангелів, * на низах скликує людський рід, * щоб одноголосну славу возсилати Христу Богові.</w:t>
+        <w:t>Із землі засяяла Предтечі глава,</w:t>
+      </w:r>
+      <w:r>
+        <w:rPr>
+          <w:rFonts w:ascii="Times New Roman" w:eastAsia="Times New Roman" w:hAnsi="Times New Roman" w:cs="Times New Roman"/>
+          <w:sz w:val="24"/>
+          <w:szCs w:val="24"/>
+        </w:rPr>
+        <w:t>*</w:t>
+      </w:r>
+      <w:r>
+        <w:rPr>
+          <w:rFonts w:ascii="Times New Roman" w:eastAsia="Times New Roman" w:hAnsi="Times New Roman" w:cs="Times New Roman"/>
+          <w:sz w:val="24"/>
+          <w:szCs w:val="24"/>
+        </w:rPr>
+        <w:t xml:space="preserve"> проміння випускає нетління, оздоровлення вірним;</w:t>
+      </w:r>
+      <w:r>
+        <w:rPr>
+          <w:rFonts w:ascii="Times New Roman" w:eastAsia="Times New Roman" w:hAnsi="Times New Roman" w:cs="Times New Roman"/>
+          <w:sz w:val="24"/>
+          <w:szCs w:val="24"/>
+        </w:rPr>
+        <w:t>*</w:t>
+      </w:r>
+      <w:r>
+        <w:rPr>
+          <w:rFonts w:ascii="Times New Roman" w:eastAsia="Times New Roman" w:hAnsi="Times New Roman" w:cs="Times New Roman"/>
+          <w:sz w:val="24"/>
+          <w:szCs w:val="24"/>
+        </w:rPr>
+        <w:t xml:space="preserve"> з висот збирає множество ангелів,</w:t>
+      </w:r>
+      <w:r>
+        <w:rPr>
+          <w:rFonts w:ascii="Times New Roman" w:eastAsia="Times New Roman" w:hAnsi="Times New Roman" w:cs="Times New Roman"/>
+          <w:sz w:val="24"/>
+          <w:szCs w:val="24"/>
+        </w:rPr>
+        <w:t>*</w:t>
+      </w:r>
+      <w:r>
+        <w:rPr>
+          <w:rFonts w:ascii="Times New Roman" w:eastAsia="Times New Roman" w:hAnsi="Times New Roman" w:cs="Times New Roman"/>
+          <w:sz w:val="24"/>
+          <w:szCs w:val="24"/>
+        </w:rPr>
+        <w:t xml:space="preserve"> на низах скликує людський рід,</w:t>
+      </w:r>
+      <w:r>
+        <w:rPr>
+          <w:rFonts w:ascii="Times New Roman" w:eastAsia="Times New Roman" w:hAnsi="Times New Roman" w:cs="Times New Roman"/>
+          <w:sz w:val="24"/>
+          <w:szCs w:val="24"/>
+        </w:rPr>
+        <w:t>*</w:t>
+      </w:r>
+      <w:r>
+        <w:rPr>
+          <w:rFonts w:ascii="Times New Roman" w:eastAsia="Times New Roman" w:hAnsi="Times New Roman" w:cs="Times New Roman"/>
+          <w:sz w:val="24"/>
+          <w:szCs w:val="24"/>
+        </w:rPr>
+        <w:t xml:space="preserve"> щоб одноголосну славу возсилати Христу Богові.</w:t>
       </w:r>
     </w:p>
     <w:p>

</xml_diff>